<commit_message>
Deployed 5550880 with MkDocs version: 1.6.1
</commit_message>
<xml_diff>
--- a/Buch Bayrische Nächte/Buch 4.docx
+++ b/Buch Bayrische Nächte/Buch 4.docx
@@ -10,11 +10,26 @@
     <w:p/>
     <w:p>
       <w:r>
-        <w:t>Anna scheidet von den Wardens langsam und wird vom kult versteckt. Dort wird sie verehrt und lernt über die andere Seite des Koinflikts, eine Seite in der die Mosnter herrschen können. Sie kämpft mit sich selbst, aber geht am Ende des Buches zu dem Kult komplett über.</w:t>
+        <w:t xml:space="preserve">Anna scheidet von den Wardens langsam und wird vom </w:t>
+      </w:r>
+      <w:r>
+        <w:t>K</w:t>
+      </w:r>
+      <w:r>
+        <w:t xml:space="preserve">ult versteckt. Dort wird sie verehrt und lernt über die andere Seite des Konflikts, eine Seite in der die </w:t>
+      </w:r>
+      <w:r>
+        <w:t>Monster</w:t>
+      </w:r>
+      <w:r>
+        <w:t xml:space="preserve"> herrschen können. Sie kämpft mit sich selbst, aber geht am Ende des Buches zu dem Kult komplett über.</w:t>
       </w:r>
     </w:p>
     <w:p/>
     <w:p>
+      <w:r>
+        <w:t xml:space="preserve">Die Helden werden von Mosnter an Bord überrascht, da Sir Charles diese zur Ablenkung mitgebracht hat. Sie bekämpfen die Monster, doch Wachen entdecken diese. </w:t>
+      </w:r>
       <w:r>
         <w:t xml:space="preserve">Marina besticht die Wachen mit viel Geld und bringt sie so fast zum Schweigen. Nur einer plaudert das Geheimnis aus, er schickt eine telegraphische Nachricht zum Kult </w:t>
       </w:r>
@@ -23,6 +38,16 @@
       </w:r>
       <w:r>
         <w:t xml:space="preserve"> und seine genaue Beschreibung des Monsters und der Helden bringt den Kult auf deren Spur. Sie schicken einen kleinen Trupp ebenfalls nach Japan, doch bereiten sich selbst in der Abwesenheit der Helden auf einen vernichtenden Schlag gegen die Custodire vor.</w:t>
+      </w:r>
+    </w:p>
+    <w:p>
+      <w:r>
+        <w:t>Ein Mann des Kultes stellt den Helden in Alexandria eine Falle, als diese nach den Überresten der alten Bibliothek suchen. Nur ihr Seelenbund und ihre Kräfte können sie retten.</w:t>
+      </w:r>
+    </w:p>
+    <w:p>
+      <w:r>
+        <w:t>Zum Ende der Fahrt bringt Sir Charles den japanischen Botschafter zu Britannien um und die Helden klären es auf. Dabei kämpfen sie gegen Sir Charles und töten ihn. Marina erfährt endlich was genau mit ihrer Mutter passiert ist.</w:t>
       </w:r>
     </w:p>
     <w:p/>

</xml_diff>

<commit_message>
Deployed 33ebda8 with MkDocs version: 1.6.1
</commit_message>
<xml_diff>
--- a/Buch Bayrische Nächte/Buch 4.docx
+++ b/Buch Bayrische Nächte/Buch 4.docx
@@ -3,13 +3,46 @@
 <w:document xmlns:wpc="http://schemas.microsoft.com/office/word/2010/wordprocessingCanvas" xmlns:cx="http://schemas.microsoft.com/office/drawing/2014/chartex" xmlns:cx1="http://schemas.microsoft.com/office/drawing/2015/9/8/chartex" xmlns:cx2="http://schemas.microsoft.com/office/drawing/2015/10/21/chartex" xmlns:cx3="http://schemas.microsoft.com/office/drawing/2016/5/9/chartex" xmlns:cx4="http://schemas.microsoft.com/office/drawing/2016/5/10/chartex" xmlns:cx5="http://schemas.microsoft.com/office/drawing/2016/5/11/chartex" xmlns:cx6="http://schemas.microsoft.com/office/drawing/2016/5/12/chartex" xmlns:cx7="http://schemas.microsoft.com/office/drawing/2016/5/13/chartex" xmlns:cx8="http://schemas.microsoft.com/office/drawing/2016/5/14/chartex" xmlns:mc="http://schemas.openxmlformats.org/markup-compatibility/2006" xmlns:aink="http://schemas.microsoft.com/office/drawing/2016/ink" xmlns:am3d="http://schemas.microsoft.com/office/drawing/2017/model3d" xmlns:o="urn:schemas-microsoft-com:office:office" xmlns:oel="http://schemas.microsoft.com/office/2019/extlst" xmlns:r="http://schemas.openxmlformats.org/officeDocument/2006/relationships" xmlns:m="http://schemas.openxmlformats.org/officeDocument/2006/math" xmlns:v="urn:schemas-microsoft-com:vml" xmlns:wp14="http://schemas.microsoft.com/office/word/2010/wordprocessingDrawing" xmlns:wp="http://schemas.openxmlformats.org/drawingml/2006/wordprocessingDrawing" xmlns:w10="urn:schemas-microsoft-com:office:word" xmlns:w="http://schemas.openxmlformats.org/wordprocessingml/2006/main" xmlns:w14="http://schemas.microsoft.com/office/word/2010/wordml" xmlns:w15="http://schemas.microsoft.com/office/word/2012/wordml" xmlns:w16cex="http://schemas.microsoft.com/office/word/2018/wordml/cex" xmlns:w16cid="http://schemas.microsoft.com/office/word/2016/wordml/cid" xmlns:w16="http://schemas.microsoft.com/office/word/2018/wordml" xmlns:w16du="http://schemas.microsoft.com/office/word/2023/wordml/word16du" xmlns:w16sdtdh="http://schemas.microsoft.com/office/word/2020/wordml/sdtdatahash" xmlns:w16sdtfl="http://schemas.microsoft.com/office/word/2024/wordml/sdtformatlock" xmlns:w16se="http://schemas.microsoft.com/office/word/2015/wordml/symex" xmlns:wpg="http://schemas.microsoft.com/office/word/2010/wordprocessingGroup" xmlns:wpi="http://schemas.microsoft.com/office/word/2010/wordprocessingInk" xmlns:wne="http://schemas.microsoft.com/office/word/2006/wordml" xmlns:wps="http://schemas.microsoft.com/office/word/2010/wordprocessingShape" mc:Ignorable="w14 w15 w16se w16cid w16 w16cex w16sdtdh w16sdtfl w16du wp14">
   <w:body>
     <w:p>
-      <w:proofErr w:type="spellStart"/>
-      <w:r>
-        <w:t>Taa-Vo</w:t>
-      </w:r>
-      <w:proofErr w:type="spellEnd"/>
-      <w:r>
-        <w:t xml:space="preserve"> ist Japan und lernt langsam deren Sprache. Er erkennt deren Schrift leicht an seiner eigenen und lernt mehr und mehr von der Zukunft.</w:t>
+      <w:r>
+        <w:t>Prolog:</w:t>
+      </w:r>
+    </w:p>
+    <w:p>
+      <w:pPr>
+        <w:rPr>
+          <w:lang w:val="en-US"/>
+        </w:rPr>
+      </w:pPr>
+      <w:r>
+        <w:rPr>
+          <w:lang w:val="en-US"/>
+        </w:rPr>
+        <w:t>Mother Pfeiffer is lying d</w:t>
+      </w:r>
+      <w:r>
+        <w:rPr>
+          <w:lang w:val="en-US"/>
+        </w:rPr>
+        <w:t xml:space="preserve">ying, thinking about her life, what she can remember, only the good. She tells her grandchildren: I remember you, and dies. She sees herself, her Soul, ascend upwards, the stare of her son following her, up through the roof and then the clouds, then a veil of white. She reminisces about what her life had meant to her, how this feeling of eath was so peaceful, yet her continuing existence a hopeful blessing. She could watch her son, her family, going on, and she would watch it all. </w:t>
+      </w:r>
+      <w:r>
+        <w:rPr>
+          <w:lang w:val="en-US"/>
+        </w:rPr>
+        <w:br/>
+        <w:t>She gets greeted by the Shepard of Souls and talks with her shortly about her son and how special he is. Then she gets let away, a gigantic grey ball in the distance, but they go another way, far away from it. To somewhere undisturbed and peaceful.</w:t>
+      </w:r>
+    </w:p>
+    <w:p>
+      <w:pPr>
+        <w:rPr>
+          <w:lang w:val="en-US"/>
+        </w:rPr>
+      </w:pPr>
+    </w:p>
+    <w:p>
+      <w:r>
+        <w:t>Taa-Vo ist Japan und lernt langsam deren Sprache. Er erkennt deren Schrift leicht an seiner eigenen und lernt mehr und mehr von der Zukunft.</w:t>
       </w:r>
     </w:p>
     <w:p/>
@@ -33,15 +66,7 @@
     <w:p/>
     <w:p>
       <w:r>
-        <w:t xml:space="preserve">Die Helden werden von </w:t>
-      </w:r>
-      <w:proofErr w:type="spellStart"/>
-      <w:r>
-        <w:t>Mosnter</w:t>
-      </w:r>
-      <w:proofErr w:type="spellEnd"/>
-      <w:r>
-        <w:t xml:space="preserve"> an Bord überrascht, da Sir Charles diese zur Ablenkung mitgebracht hat. Sie bekämpfen die Monster, doch Wachen entdecken diese. </w:t>
+        <w:t xml:space="preserve">Die Helden werden von Mosnter an Bord überrascht, da Sir Charles diese zur Ablenkung mitgebracht hat. Sie bekämpfen die Monster, doch Wachen entdecken diese. </w:t>
       </w:r>
       <w:r>
         <w:t xml:space="preserve">Marina besticht die Wachen mit viel Geld und bringt sie so fast zum Schweigen. Nur einer plaudert das Geheimnis aus, er schickt eine telegraphische Nachricht zum Kult </w:t>
@@ -50,15 +75,7 @@
         <w:t>und August,</w:t>
       </w:r>
       <w:r>
-        <w:t xml:space="preserve"> und seine genaue Beschreibung des Monsters und der Helden bringt den Kult auf deren Spur. Sie schicken einen kleinen Trupp ebenfalls nach Japan, doch bereiten sich selbst in der Abwesenheit der Helden auf einen vernichtenden Schlag gegen die </w:t>
-      </w:r>
-      <w:proofErr w:type="spellStart"/>
-      <w:r>
-        <w:t>Custodire</w:t>
-      </w:r>
-      <w:proofErr w:type="spellEnd"/>
-      <w:r>
-        <w:t xml:space="preserve"> vor.</w:t>
+        <w:t xml:space="preserve"> und seine genaue Beschreibung des Monsters und der Helden bringt den Kult auf deren Spur. Sie schicken einen kleinen Trupp ebenfalls nach Japan, doch bereiten sich selbst in der Abwesenheit der Helden auf einen vernichtenden Schlag gegen die Custodire vor.</w:t>
       </w:r>
     </w:p>
     <w:p>
@@ -72,23 +89,7 @@
         <w:t>Marina erfährt endlich was genau mit ihrer Mutter passiert ist als sie von Sir Charles gefangen genommen wird. Er will sie für eine Falle nutzen und lässt sie am Leben, nutzt sogar ihre Gestalt. Sie ist gefesselt mit dem Anti-Seelen-Metall und kann sich dennoch freisprengen, da ihre Seelen stark genug gegen das minderwertige Metall sind.</w:t>
       </w:r>
       <w:r>
-        <w:t xml:space="preserve"> (</w:t>
-      </w:r>
-      <w:proofErr w:type="spellStart"/>
-      <w:r>
-        <w:t>nichtso</w:t>
-      </w:r>
-      <w:proofErr w:type="spellEnd"/>
-      <w:r>
-        <w:t xml:space="preserve"> stark wie das von </w:t>
-      </w:r>
-      <w:proofErr w:type="spellStart"/>
-      <w:r>
-        <w:t>Nai</w:t>
-      </w:r>
-      <w:proofErr w:type="spellEnd"/>
-      <w:r>
-        <w:t xml:space="preserve"> damals)</w:t>
+        <w:t xml:space="preserve"> (nichtso stark wie das von Nai damals)</w:t>
       </w:r>
     </w:p>
     <w:p>
@@ -96,7 +97,11 @@
         <w:t xml:space="preserve">Zum Ende der Fahrt bringt Sir Charles den japanischen Botschafter zu Britannien um und die Helden klären es auf. Dabei kämpfen sie gegen Sir Charles und töten ihn. </w:t>
       </w:r>
       <w:r>
-        <w:t xml:space="preserve">Dabei verliert Friedrich seinen rechten Arm und dieser wird durch den Gestaltwandler ersetzt, was er bisher verstecken will. Er vertraut dem Gestaltwandler nicht, aber der </w:t>
+        <w:t xml:space="preserve">Dabei verliert Friedrich seinen rechten Arm und dieser wird durch den Gestaltwandler ersetzt, was er </w:t>
+      </w:r>
+      <w:r>
+        <w:lastRenderedPageBreak/>
+        <w:t xml:space="preserve">bisher verstecken will. Er vertraut dem Gestaltwandler nicht, aber der </w:t>
       </w:r>
       <w:r>
         <w:t>Verlust</w:t>

</xml_diff>

<commit_message>
Deployed d51faa1 with MkDocs version: 1.6.1
</commit_message>
<xml_diff>
--- a/Buch Bayrische Nächte/Buch 4.docx
+++ b/Buch Bayrische Nächte/Buch 4.docx
@@ -3,16 +3,19 @@
 <w:document xmlns:wpc="http://schemas.microsoft.com/office/word/2010/wordprocessingCanvas" xmlns:cx="http://schemas.microsoft.com/office/drawing/2014/chartex" xmlns:cx1="http://schemas.microsoft.com/office/drawing/2015/9/8/chartex" xmlns:cx2="http://schemas.microsoft.com/office/drawing/2015/10/21/chartex" xmlns:cx3="http://schemas.microsoft.com/office/drawing/2016/5/9/chartex" xmlns:cx4="http://schemas.microsoft.com/office/drawing/2016/5/10/chartex" xmlns:cx5="http://schemas.microsoft.com/office/drawing/2016/5/11/chartex" xmlns:cx6="http://schemas.microsoft.com/office/drawing/2016/5/12/chartex" xmlns:cx7="http://schemas.microsoft.com/office/drawing/2016/5/13/chartex" xmlns:cx8="http://schemas.microsoft.com/office/drawing/2016/5/14/chartex" xmlns:mc="http://schemas.openxmlformats.org/markup-compatibility/2006" xmlns:aink="http://schemas.microsoft.com/office/drawing/2016/ink" xmlns:am3d="http://schemas.microsoft.com/office/drawing/2017/model3d" xmlns:o="urn:schemas-microsoft-com:office:office" xmlns:oel="http://schemas.microsoft.com/office/2019/extlst" xmlns:r="http://schemas.openxmlformats.org/officeDocument/2006/relationships" xmlns:m="http://schemas.openxmlformats.org/officeDocument/2006/math" xmlns:v="urn:schemas-microsoft-com:vml" xmlns:wp14="http://schemas.microsoft.com/office/word/2010/wordprocessingDrawing" xmlns:wp="http://schemas.openxmlformats.org/drawingml/2006/wordprocessingDrawing" xmlns:w10="urn:schemas-microsoft-com:office:word" xmlns:w="http://schemas.openxmlformats.org/wordprocessingml/2006/main" xmlns:w14="http://schemas.microsoft.com/office/word/2010/wordml" xmlns:w15="http://schemas.microsoft.com/office/word/2012/wordml" xmlns:w16cex="http://schemas.microsoft.com/office/word/2018/wordml/cex" xmlns:w16cid="http://schemas.microsoft.com/office/word/2016/wordml/cid" xmlns:w16="http://schemas.microsoft.com/office/word/2018/wordml" xmlns:w16du="http://schemas.microsoft.com/office/word/2023/wordml/word16du" xmlns:w16sdtdh="http://schemas.microsoft.com/office/word/2020/wordml/sdtdatahash" xmlns:w16sdtfl="http://schemas.microsoft.com/office/word/2024/wordml/sdtformatlock" xmlns:w16se="http://schemas.microsoft.com/office/word/2015/wordml/symex" xmlns:wpg="http://schemas.microsoft.com/office/word/2010/wordprocessingGroup" xmlns:wpi="http://schemas.microsoft.com/office/word/2010/wordprocessingInk" xmlns:wne="http://schemas.microsoft.com/office/word/2006/wordml" xmlns:wps="http://schemas.microsoft.com/office/word/2010/wordprocessingShape" mc:Ignorable="w14 w15 w16se w16cid w16 w16cex w16sdtdh w16sdtfl w16du wp14">
   <w:body>
     <w:p>
-      <w:r>
+      <w:pPr>
+        <w:rPr>
+          <w:lang w:val="en-US"/>
+        </w:rPr>
+      </w:pPr>
+      <w:r>
+        <w:rPr>
+          <w:lang w:val="en-US"/>
+        </w:rPr>
         <w:t>Prolog:</w:t>
       </w:r>
     </w:p>
     <w:p>
-      <w:pPr>
-        <w:rPr>
-          <w:lang w:val="en-US"/>
-        </w:rPr>
-      </w:pPr>
       <w:r>
         <w:rPr>
           <w:lang w:val="en-US"/>
@@ -30,16 +33,13 @@
           <w:lang w:val="en-US"/>
         </w:rPr>
         <w:br/>
-        <w:t>She gets greeted by the Shepard of Souls and talks with her shortly about her son and how special he is. Then she gets let away, a gigantic grey ball in the distance, but they go another way, far away from it. To somewhere undisturbed and peaceful.</w:t>
-      </w:r>
-    </w:p>
-    <w:p>
-      <w:pPr>
-        <w:rPr>
-          <w:lang w:val="en-US"/>
-        </w:rPr>
-      </w:pPr>
-    </w:p>
+        <w:t xml:space="preserve">She gets greeted by the Shepard of Souls and talks with her shortly about her son and how special he is. Then she gets let away, a gigantic grey ball in the distance, but they go another way, far away from it. </w:t>
+      </w:r>
+      <w:r>
+        <w:t>To somewhere undisturbed and peaceful.</w:t>
+      </w:r>
+    </w:p>
+    <w:p/>
     <w:p>
       <w:r>
         <w:t>Taa-Vo ist Japan und lernt langsam deren Sprache. Er erkennt deren Schrift leicht an seiner eigenen und lernt mehr und mehr von der Zukunft.</w:t>
@@ -111,7 +111,760 @@
       </w:r>
     </w:p>
     <w:p/>
-    <w:p/>
+    <w:p>
+      <w:pPr>
+        <w:rPr>
+          <w:lang w:val="en-US"/>
+        </w:rPr>
+      </w:pPr>
+      <w:r>
+        <w:tab/>
+      </w:r>
+      <w:r>
+        <w:rPr>
+          <w:lang w:val="en-US"/>
+        </w:rPr>
+        <w:t>Marina gets tortured by Si</w:t>
+      </w:r>
+      <w:r>
+        <w:rPr>
+          <w:lang w:val="en-US"/>
+        </w:rPr>
+        <w:t>r Charles after he caught her. He says he will use her likeness to trick the others and get them too. Then he slits her throat with a knive of soulsteal, leaving her to die. The Soul of Klara sacrifices herself to safe Marina, healing her mortal wound.</w:t>
+      </w:r>
+    </w:p>
+    <w:p>
+      <w:pPr>
+        <w:rPr>
+          <w:lang w:val="en-US"/>
+        </w:rPr>
+      </w:pPr>
+      <w:r>
+        <w:rPr>
+          <w:lang w:val="en-US"/>
+        </w:rPr>
+        <w:t>Later Sir Charles comes back as Marina, wondering at hwo she had survived. He relishes thios though, as he can now torture her without her breaking easily. He starts hurting her, killing her if not ofr other souls rescuing her, before the other 4 can find Sir Charles and free Marina in a fight. Sir Charles tries to flee but Marina runs after Sir Charles up the stairs towards the ships deck.</w:t>
+      </w:r>
+    </w:p>
+    <w:p>
+      <w:pPr>
+        <w:rPr>
+          <w:lang w:val="en-US"/>
+        </w:rPr>
+      </w:pPr>
+    </w:p>
+    <w:p>
+      <w:pPr>
+        <w:rPr>
+          <w:lang w:val="en-US"/>
+        </w:rPr>
+      </w:pPr>
+    </w:p>
+    <w:p>
+      <w:pPr>
+        <w:rPr>
+          <w:lang w:val="en-US"/>
+        </w:rPr>
+      </w:pPr>
+      <w:r>
+        <w:rPr>
+          <w:lang w:val="en-US"/>
+        </w:rPr>
+        <w:tab/>
+      </w:r>
+      <w:r>
+        <w:rPr>
+          <w:lang w:val="en-US"/>
+        </w:rPr>
+        <w:t>The door to</w:t>
+      </w:r>
+      <w:r>
+        <w:rPr>
+          <w:lang w:val="en-US"/>
+        </w:rPr>
+        <w:t xml:space="preserve"> t</w:t>
+      </w:r>
+      <w:r>
+        <w:rPr>
+          <w:lang w:val="en-US"/>
+        </w:rPr>
+        <w:t>he r</w:t>
+      </w:r>
+      <w:r>
+        <w:rPr>
+          <w:lang w:val="en-US"/>
+        </w:rPr>
+        <w:t>ear upper deck burst open, splinters and dust flying over the polished floor planks. The few surprised and terrified people there turned, ran and hid as a leopard charged through their ranks, the head formed into one of a ram. Dazed from the blow to crash through the door left Charles dazed for a second before he tried to reorientate himself again, spinning hectically around on feline paws. Were to now?</w:t>
+      </w:r>
+    </w:p>
+    <w:p>
+      <w:pPr>
+        <w:rPr>
+          <w:lang w:val="en-US"/>
+        </w:rPr>
+      </w:pPr>
+      <w:r>
+        <w:rPr>
+          <w:lang w:val="en-US"/>
+        </w:rPr>
+        <w:tab/>
+        <w:t>Just a moment later Marina appeared through the settling dust, her favorite dress ripped to lose rags around her, only undergarments keeping her from being exposed. Her critical injuries had been healed, the strength of the Souls inside of her waving, as they tried to heal any superficial cuts on her flesh.</w:t>
+      </w:r>
+    </w:p>
+    <w:p>
+      <w:pPr>
+        <w:rPr>
+          <w:lang w:val="en-US"/>
+        </w:rPr>
+      </w:pPr>
+      <w:r>
+        <w:rPr>
+          <w:lang w:val="en-US"/>
+        </w:rPr>
+        <w:tab/>
+        <w:t>“No more, my friends,” Marina thought to them, “preserve what you have left. I</w:t>
+      </w:r>
+      <w:r>
+        <w:rPr>
+          <w:lang w:val="en-US"/>
+        </w:rPr>
+        <w:t>t</w:t>
+      </w:r>
+      <w:r>
+        <w:rPr>
+          <w:lang w:val="en-US"/>
+        </w:rPr>
+        <w:t xml:space="preserve"> is not over yet.”</w:t>
+      </w:r>
+      <w:r>
+        <w:rPr>
+          <w:lang w:val="en-US"/>
+        </w:rPr>
+        <w:t xml:space="preserve"> The healing stopped and the pain reappeared so sudden she almost fainted.</w:t>
+      </w:r>
+    </w:p>
+    <w:p>
+      <w:pPr>
+        <w:rPr>
+          <w:lang w:val="en-US"/>
+        </w:rPr>
+      </w:pPr>
+      <w:r>
+        <w:rPr>
+          <w:lang w:val="en-US"/>
+        </w:rPr>
+        <w:tab/>
+        <w:t xml:space="preserve">She stumbled over the last step, holding on to the railing next to her, spotting the frantic animal on deck, as its fur changed to feathers, ram head to beak and sharp eyes. Eyes full of terror. He transformed into a small </w:t>
+      </w:r>
+      <w:r>
+        <w:rPr>
+          <w:lang w:val="en-US"/>
+        </w:rPr>
+        <w:t>peregrine</w:t>
+      </w:r>
+      <w:r>
+        <w:rPr>
+          <w:lang w:val="en-US"/>
+        </w:rPr>
+        <w:t xml:space="preserve"> </w:t>
+      </w:r>
+      <w:r>
+        <w:rPr>
+          <w:lang w:val="en-US"/>
+        </w:rPr>
+        <w:t>falcon</w:t>
+      </w:r>
+      <w:r>
+        <w:rPr>
+          <w:lang w:val="en-US"/>
+        </w:rPr>
+        <w:t xml:space="preserve">, wings batting against the fresh air of the </w:t>
+      </w:r>
+      <w:r>
+        <w:rPr>
+          <w:lang w:val="en-US"/>
+        </w:rPr>
+        <w:t xml:space="preserve">dusk. Silly man, thinking this type of bird would be the fastest. Only when descending you </w:t>
+      </w:r>
+      <w:r>
+        <w:rPr>
+          <w:lang w:val="en-US"/>
+        </w:rPr>
+        <w:t>Trelos</w:t>
+      </w:r>
+      <w:r>
+        <w:rPr>
+          <w:rStyle w:val="Funotenzeichen"/>
+          <w:lang w:val="en-US"/>
+        </w:rPr>
+        <w:footnoteReference w:id="1"/>
+      </w:r>
+      <w:r>
+        <w:rPr>
+          <w:lang w:val="en-US"/>
+        </w:rPr>
+        <w:t>. Finding her focus and i</w:t>
+      </w:r>
+      <w:r>
+        <w:rPr>
+          <w:lang w:val="en-US"/>
+        </w:rPr>
+        <w:t>nner strength Marina tried to form the now familiar wings around her, made from Souls and sheer willpower. But all of them were so tired and beaten, as soon as the white shimmering image of smoke appeared it flickered back to nothingness.</w:t>
+      </w:r>
+    </w:p>
+    <w:p>
+      <w:pPr>
+        <w:rPr>
+          <w:lang w:val="en-US"/>
+        </w:rPr>
+      </w:pPr>
+      <w:r>
+        <w:rPr>
+          <w:lang w:val="en-US"/>
+        </w:rPr>
+        <w:tab/>
+        <w:t>“One last time! We can do it, end it here! Lend me this power, so we can rest forever.”</w:t>
+      </w:r>
+    </w:p>
+    <w:p>
+      <w:pPr>
+        <w:rPr>
+          <w:lang w:val="en-US"/>
+        </w:rPr>
+      </w:pPr>
+      <w:r>
+        <w:rPr>
+          <w:lang w:val="en-US"/>
+        </w:rPr>
+        <w:tab/>
+        <w:t xml:space="preserve">But it would not help. She barely heard their voices in her head. If she had not stopped them from healing her further more would have vanished. Gone somewhere she </w:t>
+      </w:r>
+      <w:r>
+        <w:rPr>
+          <w:lang w:val="en-US"/>
+        </w:rPr>
+        <w:lastRenderedPageBreak/>
+        <w:t>could not follow. Fading away to nothingness. All the anger she had held while chasing and crushing Charles was starting to turn frustration. He would not get away from her. She would find a way, right now to follow him into the air. She could see him still, not too far, in reach still if she hurried on now.</w:t>
+      </w:r>
+    </w:p>
+    <w:p>
+      <w:pPr>
+        <w:rPr>
+          <w:lang w:val="en-US"/>
+        </w:rPr>
+      </w:pPr>
+      <w:r>
+        <w:rPr>
+          <w:lang w:val="en-US"/>
+        </w:rPr>
+        <w:tab/>
+        <w:t xml:space="preserve">Then two figures stepped next to her, boots thumping on wood, a rhythm of steadiness and foundation. Solemn faces appeared next to her, Friedrich to her left, Alexander to her right. They had seen the bird too, but they were not afraid nor angry. Determination sparkled in their eyes and as they laid their hands on each of her arms all pain fled from the warmth they radiated. Souls she only had felt from afar were joining her retinue, wandering from her friends to herself. It felt so </w:t>
+      </w:r>
+      <w:r>
+        <w:rPr>
+          <w:lang w:val="en-US"/>
+        </w:rPr>
+        <w:t>grand</w:t>
+      </w:r>
+      <w:r>
+        <w:rPr>
+          <w:lang w:val="en-US"/>
+        </w:rPr>
+        <w:t>, so much power, so much</w:t>
+      </w:r>
+      <w:r>
+        <w:rPr>
+          <w:lang w:val="en-US"/>
+        </w:rPr>
+        <w:t xml:space="preserve"> ability. Inside of her a choir of voices erupted, known ones and new, chanting her on with vigorous zeal, stacking on top of each other, barely audible over the noise they made inside of her head.</w:t>
+      </w:r>
+    </w:p>
+    <w:p>
+      <w:pPr>
+        <w:rPr>
+          <w:lang w:val="en-US"/>
+        </w:rPr>
+      </w:pPr>
+      <w:r>
+        <w:rPr>
+          <w:lang w:val="en-US"/>
+        </w:rPr>
+        <w:tab/>
+        <w:t>“Marina!”</w:t>
+      </w:r>
+    </w:p>
+    <w:p>
+      <w:pPr>
+        <w:rPr>
+          <w:lang w:val="en-US"/>
+        </w:rPr>
+      </w:pPr>
+      <w:r>
+        <w:rPr>
+          <w:lang w:val="en-US"/>
+        </w:rPr>
+        <w:tab/>
+        <w:t>“</w:t>
+      </w:r>
+      <w:r>
+        <w:rPr>
+          <w:lang w:val="en-US"/>
+        </w:rPr>
+        <w:t>Bixlmadam</w:t>
+      </w:r>
+      <w:r>
+        <w:rPr>
+          <w:rStyle w:val="Funotenzeichen"/>
+          <w:lang w:val="en-US"/>
+        </w:rPr>
+        <w:footnoteReference w:id="2"/>
+      </w:r>
+      <w:r>
+        <w:rPr>
+          <w:lang w:val="en-US"/>
+        </w:rPr>
+        <w:t>, you are not that bad. Go get him.”</w:t>
+      </w:r>
+    </w:p>
+    <w:p>
+      <w:pPr>
+        <w:rPr>
+          <w:lang w:val="en-US"/>
+        </w:rPr>
+      </w:pPr>
+      <w:r>
+        <w:rPr>
+          <w:lang w:val="en-US"/>
+        </w:rPr>
+        <w:tab/>
+        <w:t>“I believe in you.”</w:t>
+      </w:r>
+    </w:p>
+    <w:p>
+      <w:pPr>
+        <w:rPr>
+          <w:lang w:val="en-US"/>
+        </w:rPr>
+      </w:pPr>
+      <w:r>
+        <w:rPr>
+          <w:lang w:val="en-US"/>
+        </w:rPr>
+        <w:tab/>
+        <w:t>“Marina…”</w:t>
+      </w:r>
+    </w:p>
+    <w:p>
+      <w:pPr>
+        <w:ind w:firstLine="708"/>
+        <w:rPr>
+          <w:lang w:val="en-US"/>
+        </w:rPr>
+      </w:pPr>
+      <w:r>
+        <w:rPr>
+          <w:lang w:val="en-US"/>
+        </w:rPr>
+        <w:t>She looked over to Friedrich, who gave her a curt nod, then over to Alexander, his smile so bright. He spoke to her.</w:t>
+      </w:r>
+    </w:p>
+    <w:p>
+      <w:pPr>
+        <w:rPr>
+          <w:lang w:val="en-US"/>
+        </w:rPr>
+      </w:pPr>
+      <w:r>
+        <w:rPr>
+          <w:lang w:val="en-US"/>
+        </w:rPr>
+        <w:tab/>
+        <w:t>“End him. For your mother”</w:t>
+      </w:r>
+    </w:p>
+    <w:p>
+      <w:pPr>
+        <w:rPr>
+          <w:lang w:val="en-US"/>
+        </w:rPr>
+      </w:pPr>
+      <w:r>
+        <w:rPr>
+          <w:lang w:val="en-US"/>
+        </w:rPr>
+        <w:tab/>
+        <w:t>With that, gigantic wings formed behind Marina, ones so magnificent she had never even dreamed of. The confused passengers around them were ducking from the sight, so powerful was the Soulbinding even they could see it. Without her mental command the wings started beating, air pressure forming under them and her as other Souls started spinning next to her. Raw might, more than any one of them had even held, was focused inside of her now, together with their trust and friendship. They all had one goal at this instance of time and she would be the one to deliver it. With a final beat she jumped from the deck, the force of her push so drastic that planks below her broke and screamed.</w:t>
+      </w:r>
+      <w:r>
+        <w:rPr>
+          <w:lang w:val="en-US"/>
+        </w:rPr>
+        <w:t xml:space="preserve"> She rose into the air with unbelievable speed and joy. It was not over yet.</w:t>
+      </w:r>
+    </w:p>
+    <w:p>
+      <w:pPr>
+        <w:rPr>
+          <w:lang w:val="en-US"/>
+        </w:rPr>
+      </w:pPr>
+      <w:r>
+        <w:rPr>
+          <w:lang w:val="en-US"/>
+        </w:rPr>
+        <w:tab/>
+        <w:t xml:space="preserve">She soared through the sky, air around her slashing at her face and tearing of the rest of her red dress, only rags left of it. They tumbled through the aftershock of her ascent, before they lazily drifted towards the ship’s deck. Her eyes started to tear, the force of her acceleration too much. She tried to blink away the sensation and effects, but to no avail. Through her watery gaze she followed the lonely falcon, which tried to flee into the sunset, before it dove down towards the water, gaining incredibly momentum. So much so that Marina was not sure if she could make it, catch it. Catch him. Then incorporeal white hands </w:t>
+      </w:r>
+      <w:r>
+        <w:rPr>
+          <w:lang w:val="en-US"/>
+        </w:rPr>
+        <w:lastRenderedPageBreak/>
+        <w:t>were laid on top of each other, without her having to form a mental image. Fingers sharpened to points of knives, like spear tips, pushing aside the wind, forming a bubble of calm around her. How far could she take this journey? How far could she fly?</w:t>
+      </w:r>
+    </w:p>
+    <w:p>
+      <w:pPr>
+        <w:rPr>
+          <w:lang w:val="en-US"/>
+        </w:rPr>
+      </w:pPr>
+      <w:r>
+        <w:rPr>
+          <w:lang w:val="en-US"/>
+        </w:rPr>
+        <w:tab/>
+        <w:t>As if sensing her doubt and desperation the shape of a face started to form in her vision, so familiar, and old memory. Like a dream becoming reality, a shape you just new from touch, scent you could name after just one breath.</w:t>
+      </w:r>
+    </w:p>
+    <w:p>
+      <w:pPr>
+        <w:rPr>
+          <w:lang w:val="en-US"/>
+        </w:rPr>
+      </w:pPr>
+      <w:r>
+        <w:rPr>
+          <w:lang w:val="en-US"/>
+        </w:rPr>
+        <w:tab/>
+        <w:t>“Mother? Mitera</w:t>
+      </w:r>
+      <w:r>
+        <w:rPr>
+          <w:rStyle w:val="Funotenzeichen"/>
+          <w:lang w:val="en-US"/>
+        </w:rPr>
+        <w:footnoteReference w:id="3"/>
+      </w:r>
+      <w:r>
+        <w:rPr>
+          <w:lang w:val="en-US"/>
+        </w:rPr>
+        <w:t>? Is it you?”</w:t>
+      </w:r>
+    </w:p>
+    <w:p>
+      <w:pPr>
+        <w:rPr>
+          <w:lang w:val="en-US"/>
+        </w:rPr>
+      </w:pPr>
+      <w:r>
+        <w:rPr>
+          <w:lang w:val="en-US"/>
+        </w:rPr>
+        <w:tab/>
+        <w:t>“Yes, child. Have no fear. I will take you this last step,” answered her mother’s voice inside of her thoughts, just like she remembered.</w:t>
+      </w:r>
+      <w:r>
+        <w:rPr>
+          <w:lang w:val="en-US"/>
+        </w:rPr>
+        <w:t xml:space="preserve"> All the safety and security she had missed since then, what she had needed to fully grew to her real self. It was all her now, in just a face words.</w:t>
+      </w:r>
+    </w:p>
+    <w:p>
+      <w:pPr>
+        <w:ind w:firstLine="708"/>
+        <w:rPr>
+          <w:lang w:val="en-US"/>
+        </w:rPr>
+      </w:pPr>
+      <w:r>
+        <w:rPr>
+          <w:lang w:val="en-US"/>
+        </w:rPr>
+        <w:t>It had been this day, twenty-five years ago. The day she had lost her mother. And now she was back.</w:t>
+      </w:r>
+      <w:r>
+        <w:rPr>
+          <w:lang w:val="en-US"/>
+        </w:rPr>
+        <w:t xml:space="preserve"> Familiar hands were laid on top of Marina’s, so soft, so warm. Again, tears flew from Marina’s eyes, the wind around her still and quiet.</w:t>
+      </w:r>
+      <w:r>
+        <w:rPr>
+          <w:lang w:val="en-US"/>
+        </w:rPr>
+        <w:t xml:space="preserve"> Then her mother’s hands moved away from her, the feeling of safeness staying. They pressed together like in a prayer, piercing her canopy made of Souls, forming the furthest point of her spear. She dove after the falcon, her strength renewed still. The falcon’s trajectory arced before it hit the water, its speed growing even more without a single wing beat. Marina followed it precisely, water under her rippling, building waves. </w:t>
+      </w:r>
+      <w:r>
+        <w:rPr>
+          <w:lang w:val="en-US"/>
+        </w:rPr>
+        <w:t xml:space="preserve">The rose and rose higher into the sky, besides the clouds stars forming their familiar shapes and patterns. They were higher than they had been before the ship below them almost only a speck in the endless sea. </w:t>
+      </w:r>
+      <w:r>
+        <w:rPr>
+          <w:lang w:val="en-US"/>
+        </w:rPr>
+        <w:t xml:space="preserve">Charles must have </w:t>
+      </w:r>
+      <w:r>
+        <w:rPr>
+          <w:lang w:val="en-US"/>
+        </w:rPr>
+        <w:t>felt it, her persuid becoming so close</w:t>
+      </w:r>
+      <w:r>
+        <w:rPr>
+          <w:lang w:val="en-US"/>
+        </w:rPr>
+        <w:t>, for he turned his head to see, breaking his speed in the process</w:t>
+      </w:r>
+      <w:r>
+        <w:rPr>
+          <w:lang w:val="en-US"/>
+        </w:rPr>
+        <w:t>, starting to transform again</w:t>
+      </w:r>
+      <w:r>
+        <w:rPr>
+          <w:lang w:val="en-US"/>
+        </w:rPr>
+        <w:t>. A fatal mistake. Now sure she would catch him</w:t>
+      </w:r>
+      <w:r>
+        <w:rPr>
+          <w:lang w:val="en-US"/>
+        </w:rPr>
+        <w:t xml:space="preserve"> Marina poured every ounce of strength into speed; every Soul linked to her doing the same. Thoughts blurred, were unnecessary, only her reaching this pest, this criminal, this murderer. That was enough.</w:t>
+      </w:r>
+    </w:p>
+    <w:p>
+      <w:pPr>
+        <w:ind w:firstLine="708"/>
+        <w:rPr>
+          <w:lang w:val="en-US"/>
+        </w:rPr>
+      </w:pPr>
+      <w:r>
+        <w:rPr>
+          <w:lang w:val="en-US"/>
+        </w:rPr>
+        <w:t>A terrifying sound erupted behind her, so tremendously loud, like the shots of hundred cannons at once. He eardrums almost tore, if not for the shield around her and the healing power of her Souls. With the blink of an eye, she reached her target, vision blackening, almost giving away her consciousness.</w:t>
+      </w:r>
+    </w:p>
+    <w:p>
+      <w:pPr>
+        <w:ind w:firstLine="708"/>
+        <w:rPr>
+          <w:lang w:val="en-US"/>
+        </w:rPr>
+      </w:pPr>
+      <w:r>
+        <w:rPr>
+          <w:lang w:val="en-US"/>
+        </w:rPr>
+        <w:t>Without knowing she had come to a stop, her undergarments still fluttering in the winds in the direction she had went before until a second later they came to a stop and gently laid on her skin. All the Souls around her appeared to have vanished, even though she still floated above the water and ship, hundreds of meters in the air. Around her white angelic feathers slowly rippled through the sky. Her mother’s face appeared once more, her hands holding a pair of others, another figure that was familiar to Marina, but one she could not accurately place.</w:t>
+      </w:r>
+    </w:p>
+    <w:p>
+      <w:pPr>
+        <w:ind w:firstLine="708"/>
+        <w:rPr>
+          <w:lang w:val="en-US"/>
+        </w:rPr>
+      </w:pPr>
+      <w:r>
+        <w:rPr>
+          <w:lang w:val="en-US"/>
+        </w:rPr>
+        <w:lastRenderedPageBreak/>
+        <w:t>“I will take her with me now, Marina,” the other figure spoke, only her hands shown, “She will finally rest now, all thanks to you.”</w:t>
+      </w:r>
+    </w:p>
+    <w:p>
+      <w:pPr>
+        <w:ind w:firstLine="708"/>
+        <w:rPr>
+          <w:lang w:val="en-US"/>
+        </w:rPr>
+      </w:pPr>
+      <w:r>
+        <w:rPr>
+          <w:lang w:val="en-US"/>
+        </w:rPr>
+        <w:t>“Thank you, my child,” her mother said, so much love inside of her voice. One Marina would love to hold on forever. But she would not lose it now, it would be with her, every day. “Together we brought to an end what I had started. For you have become</w:t>
+      </w:r>
+      <w:r>
+        <w:rPr>
+          <w:lang w:val="en-US"/>
+        </w:rPr>
+        <w:t xml:space="preserve"> something more than me. I hope you will treasure my love forever. I wish I could stay, but you know as much as me that this cannot be. Tell your father I am waiting for him. And I am waiting for you too. Goodbye.</w:t>
+      </w:r>
+      <w:r>
+        <w:rPr>
+          <w:lang w:val="en-US"/>
+        </w:rPr>
+        <w:t>”</w:t>
+      </w:r>
+    </w:p>
+    <w:p>
+      <w:pPr>
+        <w:ind w:firstLine="708"/>
+        <w:rPr>
+          <w:lang w:val="en-US"/>
+        </w:rPr>
+      </w:pPr>
+      <w:r>
+        <w:rPr>
+          <w:lang w:val="en-US"/>
+        </w:rPr>
+        <w:t>“I love you mother.”</w:t>
+      </w:r>
+    </w:p>
+    <w:p>
+      <w:pPr>
+        <w:ind w:firstLine="708"/>
+        <w:rPr>
+          <w:lang w:val="en-US"/>
+        </w:rPr>
+      </w:pPr>
+      <w:r>
+        <w:rPr>
+          <w:lang w:val="en-US"/>
+        </w:rPr>
+        <w:t>And with that the last of her mother’s form vanished, the two pairs of hands raising up into space she could not see or fathom. The feathers around her turned to brown, the color of the falcon. Of Charles. Marina turned around, spotting the rest of its body, his head and shoulders having turned to a human form again, one she had not seen before, old, wrinkly, ancient. Hate was in his eyes, no repent, only sorrow and pain. Flakes fell from the its form, which in turn crumbled to dust blown away to the void. An eye stayed last, staring at her, past her, where her mother had been. Then it vanished and the sky was clear.</w:t>
+      </w:r>
+    </w:p>
+    <w:p>
+      <w:pPr>
+        <w:ind w:firstLine="708"/>
+        <w:rPr>
+          <w:lang w:val="en-US"/>
+        </w:rPr>
+      </w:pPr>
+      <w:r>
+        <w:rPr>
+          <w:lang w:val="en-US"/>
+        </w:rPr>
+        <w:t>That was the moment Marina lost consciousness.</w:t>
+      </w:r>
+    </w:p>
+    <w:p>
+      <w:pPr>
+        <w:ind w:firstLine="708"/>
+        <w:rPr>
+          <w:lang w:val="en-US"/>
+        </w:rPr>
+      </w:pPr>
+    </w:p>
+    <w:p>
+      <w:pPr>
+        <w:ind w:firstLine="708"/>
+        <w:rPr>
+          <w:lang w:val="en-US"/>
+        </w:rPr>
+      </w:pPr>
+    </w:p>
+    <w:p>
+      <w:pPr>
+        <w:ind w:firstLine="708"/>
+        <w:rPr>
+          <w:lang w:val="en-US"/>
+        </w:rPr>
+      </w:pPr>
+      <w:r>
+        <w:rPr>
+          <w:lang w:val="en-US"/>
+        </w:rPr>
+        <w:t>Marina gets caught by the other four and all the Souls they had been gathered so far. She feels their love and friendship before she drifts to well earned sleep.</w:t>
+      </w:r>
+    </w:p>
+    <w:p>
+      <w:pPr>
+        <w:ind w:firstLine="708"/>
+        <w:rPr>
+          <w:lang w:val="en-US"/>
+        </w:rPr>
+      </w:pPr>
+    </w:p>
+    <w:p>
+      <w:pPr>
+        <w:ind w:firstLine="708"/>
+        <w:rPr>
+          <w:lang w:val="en-US"/>
+        </w:rPr>
+      </w:pPr>
+    </w:p>
+    <w:p>
+      <w:pPr>
+        <w:ind w:firstLine="708"/>
+        <w:rPr>
+          <w:lang w:val="en-US"/>
+        </w:rPr>
+      </w:pPr>
+      <w:r>
+        <w:rPr>
+          <w:lang w:val="en-US"/>
+        </w:rPr>
+        <w:t>Epilouge</w:t>
+      </w:r>
+    </w:p>
+    <w:p>
+      <w:pPr>
+        <w:rPr>
+          <w:lang w:val="en-US"/>
+        </w:rPr>
+      </w:pPr>
+      <w:r>
+        <w:rPr>
+          <w:lang w:val="en-US"/>
+        </w:rPr>
+        <w:t>A man picks up a coin he found on deck, one that had fallen out of the sky. Just moments before a flashj of light ahd blinded them all up here, a vpoice telling them they owould not tell about what had happened here. Othjers semed to have forgotten, wondering at the destroyed planks and wooden door. But he did not, something stirred inside of him, a need to bring this coin somewhere to Japan, the shores of the land he could see from here.</w:t>
+      </w:r>
+    </w:p>
+    <w:p>
+      <w:pPr>
+        <w:ind w:firstLine="708"/>
+        <w:rPr>
+          <w:lang w:val="en-US"/>
+        </w:rPr>
+      </w:pPr>
+    </w:p>
+    <w:p>
+      <w:pPr>
+        <w:rPr>
+          <w:lang w:val="en-US"/>
+        </w:rPr>
+      </w:pPr>
+    </w:p>
+    <w:p>
+      <w:pPr>
+        <w:rPr>
+          <w:lang w:val="en-US"/>
+        </w:rPr>
+      </w:pPr>
+    </w:p>
+    <w:p>
+      <w:pPr>
+        <w:rPr>
+          <w:lang w:val="en-US"/>
+        </w:rPr>
+      </w:pPr>
+    </w:p>
     <w:sectPr>
       <w:pgSz w:w="11906" w:h="16838"/>
       <w:pgMar w:top="1417" w:right="1417" w:bottom="1134" w:left="1417" w:header="708" w:footer="708" w:gutter="0"/>
@@ -120,6 +873,202 @@
     </w:sectPr>
   </w:body>
 </w:document>
+</file>
+
+<file path=word/endnotes.xml><?xml version="1.0" encoding="utf-8"?>
+<w:endnotes xmlns:wpc="http://schemas.microsoft.com/office/word/2010/wordprocessingCanvas" xmlns:cx="http://schemas.microsoft.com/office/drawing/2014/chartex" xmlns:cx1="http://schemas.microsoft.com/office/drawing/2015/9/8/chartex" xmlns:cx2="http://schemas.microsoft.com/office/drawing/2015/10/21/chartex" xmlns:cx3="http://schemas.microsoft.com/office/drawing/2016/5/9/chartex" xmlns:cx4="http://schemas.microsoft.com/office/drawing/2016/5/10/chartex" xmlns:cx5="http://schemas.microsoft.com/office/drawing/2016/5/11/chartex" xmlns:cx6="http://schemas.microsoft.com/office/drawing/2016/5/12/chartex" xmlns:cx7="http://schemas.microsoft.com/office/drawing/2016/5/13/chartex" xmlns:cx8="http://schemas.microsoft.com/office/drawing/2016/5/14/chartex" xmlns:mc="http://schemas.openxmlformats.org/markup-compatibility/2006" xmlns:aink="http://schemas.microsoft.com/office/drawing/2016/ink" xmlns:am3d="http://schemas.microsoft.com/office/drawing/2017/model3d" xmlns:o="urn:schemas-microsoft-com:office:office" xmlns:oel="http://schemas.microsoft.com/office/2019/extlst" xmlns:r="http://schemas.openxmlformats.org/officeDocument/2006/relationships" xmlns:m="http://schemas.openxmlformats.org/officeDocument/2006/math" xmlns:v="urn:schemas-microsoft-com:vml" xmlns:wp14="http://schemas.microsoft.com/office/word/2010/wordprocessingDrawing" xmlns:wp="http://schemas.openxmlformats.org/drawingml/2006/wordprocessingDrawing" xmlns:w10="urn:schemas-microsoft-com:office:word" xmlns:w="http://schemas.openxmlformats.org/wordprocessingml/2006/main" xmlns:w14="http://schemas.microsoft.com/office/word/2010/wordml" xmlns:w15="http://schemas.microsoft.com/office/word/2012/wordml" xmlns:w16cex="http://schemas.microsoft.com/office/word/2018/wordml/cex" xmlns:w16cid="http://schemas.microsoft.com/office/word/2016/wordml/cid" xmlns:w16="http://schemas.microsoft.com/office/word/2018/wordml" xmlns:w16du="http://schemas.microsoft.com/office/word/2023/wordml/word16du" xmlns:w16sdtdh="http://schemas.microsoft.com/office/word/2020/wordml/sdtdatahash" xmlns:w16sdtfl="http://schemas.microsoft.com/office/word/2024/wordml/sdtformatlock" xmlns:w16se="http://schemas.microsoft.com/office/word/2015/wordml/symex" xmlns:wpg="http://schemas.microsoft.com/office/word/2010/wordprocessingGroup" xmlns:wpi="http://schemas.microsoft.com/office/word/2010/wordprocessingInk" xmlns:wne="http://schemas.microsoft.com/office/word/2006/wordml" xmlns:wps="http://schemas.microsoft.com/office/word/2010/wordprocessingShape" mc:Ignorable="w14 w15 w16se w16cid w16 w16cex w16sdtdh w16sdtfl w16du wp14">
+  <w:endnote w:type="separator" w:id="-1">
+    <w:p>
+      <w:pPr>
+        <w:spacing w:after="0" w:line="240" w:lineRule="auto"/>
+      </w:pPr>
+      <w:r>
+        <w:separator/>
+      </w:r>
+    </w:p>
+  </w:endnote>
+  <w:endnote w:type="continuationSeparator" w:id="0">
+    <w:p>
+      <w:pPr>
+        <w:spacing w:after="0" w:line="240" w:lineRule="auto"/>
+      </w:pPr>
+      <w:r>
+        <w:continuationSeparator/>
+      </w:r>
+    </w:p>
+  </w:endnote>
+</w:endnotes>
+</file>
+
+<file path=word/footnotes.xml><?xml version="1.0" encoding="utf-8"?>
+<w:footnotes xmlns:wpc="http://schemas.microsoft.com/office/word/2010/wordprocessingCanvas" xmlns:cx="http://schemas.microsoft.com/office/drawing/2014/chartex" xmlns:cx1="http://schemas.microsoft.com/office/drawing/2015/9/8/chartex" xmlns:cx2="http://schemas.microsoft.com/office/drawing/2015/10/21/chartex" xmlns:cx3="http://schemas.microsoft.com/office/drawing/2016/5/9/chartex" xmlns:cx4="http://schemas.microsoft.com/office/drawing/2016/5/10/chartex" xmlns:cx5="http://schemas.microsoft.com/office/drawing/2016/5/11/chartex" xmlns:cx6="http://schemas.microsoft.com/office/drawing/2016/5/12/chartex" xmlns:cx7="http://schemas.microsoft.com/office/drawing/2016/5/13/chartex" xmlns:cx8="http://schemas.microsoft.com/office/drawing/2016/5/14/chartex" xmlns:mc="http://schemas.openxmlformats.org/markup-compatibility/2006" xmlns:aink="http://schemas.microsoft.com/office/drawing/2016/ink" xmlns:am3d="http://schemas.microsoft.com/office/drawing/2017/model3d" xmlns:o="urn:schemas-microsoft-com:office:office" xmlns:oel="http://schemas.microsoft.com/office/2019/extlst" xmlns:r="http://schemas.openxmlformats.org/officeDocument/2006/relationships" xmlns:m="http://schemas.openxmlformats.org/officeDocument/2006/math" xmlns:v="urn:schemas-microsoft-com:vml" xmlns:wp14="http://schemas.microsoft.com/office/word/2010/wordprocessingDrawing" xmlns:wp="http://schemas.openxmlformats.org/drawingml/2006/wordprocessingDrawing" xmlns:w10="urn:schemas-microsoft-com:office:word" xmlns:w="http://schemas.openxmlformats.org/wordprocessingml/2006/main" xmlns:w14="http://schemas.microsoft.com/office/word/2010/wordml" xmlns:w15="http://schemas.microsoft.com/office/word/2012/wordml" xmlns:w16cex="http://schemas.microsoft.com/office/word/2018/wordml/cex" xmlns:w16cid="http://schemas.microsoft.com/office/word/2016/wordml/cid" xmlns:w16="http://schemas.microsoft.com/office/word/2018/wordml" xmlns:w16du="http://schemas.microsoft.com/office/word/2023/wordml/word16du" xmlns:w16sdtdh="http://schemas.microsoft.com/office/word/2020/wordml/sdtdatahash" xmlns:w16sdtfl="http://schemas.microsoft.com/office/word/2024/wordml/sdtformatlock" xmlns:w16se="http://schemas.microsoft.com/office/word/2015/wordml/symex" xmlns:wpg="http://schemas.microsoft.com/office/word/2010/wordprocessingGroup" xmlns:wpi="http://schemas.microsoft.com/office/word/2010/wordprocessingInk" xmlns:wne="http://schemas.microsoft.com/office/word/2006/wordml" xmlns:wps="http://schemas.microsoft.com/office/word/2010/wordprocessingShape" mc:Ignorable="w14 w15 w16se w16cid w16 w16cex w16sdtdh w16sdtfl w16du wp14">
+  <w:footnote w:type="separator" w:id="-1">
+    <w:p>
+      <w:pPr>
+        <w:spacing w:after="0" w:line="240" w:lineRule="auto"/>
+      </w:pPr>
+      <w:r>
+        <w:separator/>
+      </w:r>
+    </w:p>
+  </w:footnote>
+  <w:footnote w:type="continuationSeparator" w:id="0">
+    <w:p>
+      <w:pPr>
+        <w:spacing w:after="0" w:line="240" w:lineRule="auto"/>
+      </w:pPr>
+      <w:r>
+        <w:continuationSeparator/>
+      </w:r>
+    </w:p>
+  </w:footnote>
+  <w:footnote w:id="1">
+    <w:p>
+      <w:pPr>
+        <w:pStyle w:val="Funotentext"/>
+        <w:rPr>
+          <w:lang w:val="en-US"/>
+        </w:rPr>
+      </w:pPr>
+      <w:r>
+        <w:rPr>
+          <w:rStyle w:val="Funotenzeichen"/>
+        </w:rPr>
+        <w:footnoteRef/>
+      </w:r>
+      <w:r>
+        <w:rPr>
+          <w:lang w:val="en-US"/>
+        </w:rPr>
+        <w:t xml:space="preserve"> </w:t>
+      </w:r>
+      <w:r>
+        <w:rPr>
+          <w:b/>
+          <w:lang w:val="en-US"/>
+        </w:rPr>
+        <w:t>Trelos</w:t>
+      </w:r>
+      <w:r>
+        <w:rPr>
+          <w:lang w:val="en-US"/>
+        </w:rPr>
+        <w:t xml:space="preserve"> [treˈlos]: Greek, </w:t>
+      </w:r>
+      <w:r>
+        <w:rPr>
+          <w:lang w:val="en-US"/>
+        </w:rPr>
+        <w:t>‘</w:t>
+      </w:r>
+      <w:r>
+        <w:rPr>
+          <w:lang w:val="en-US"/>
+        </w:rPr>
+        <w:t>fool</w:t>
+      </w:r>
+      <w:r>
+        <w:rPr>
+          <w:lang w:val="en-US"/>
+        </w:rPr>
+        <w:t>’</w:t>
+      </w:r>
+    </w:p>
+  </w:footnote>
+  <w:footnote w:id="2">
+    <w:p>
+      <w:pPr>
+        <w:pStyle w:val="Funotentext"/>
+        <w:rPr>
+          <w:lang w:val="en-US"/>
+        </w:rPr>
+      </w:pPr>
+      <w:r>
+        <w:rPr>
+          <w:rStyle w:val="Funotenzeichen"/>
+        </w:rPr>
+        <w:footnoteRef/>
+      </w:r>
+      <w:r>
+        <w:rPr>
+          <w:lang w:val="en-US"/>
+        </w:rPr>
+        <w:t xml:space="preserve"> </w:t>
+      </w:r>
+      <w:r>
+        <w:rPr>
+          <w:b/>
+          <w:lang w:val="en-US"/>
+        </w:rPr>
+        <w:t>Bixlmadam</w:t>
+      </w:r>
+      <w:r>
+        <w:rPr>
+          <w:lang w:val="en-US"/>
+        </w:rPr>
+        <w:t xml:space="preserve"> [ˈbɪksl̩ˌmaːdam]: woman dressing rich and s</w:t>
+      </w:r>
+      <w:r>
+        <w:rPr>
+          <w:lang w:val="en-US"/>
+        </w:rPr>
+        <w:t>plendorous but is poor in</w:t>
+      </w:r>
+      <w:r>
+        <w:rPr>
+          <w:lang w:val="en-US"/>
+        </w:rPr>
+        <w:t xml:space="preserve"> </w:t>
+      </w:r>
+      <w:r>
+        <w:rPr>
+          <w:lang w:val="en-US"/>
+        </w:rPr>
+        <w:t>reality</w:t>
+      </w:r>
+    </w:p>
+  </w:footnote>
+  <w:footnote w:id="3">
+    <w:p>
+      <w:pPr>
+        <w:pStyle w:val="Funotentext"/>
+        <w:rPr>
+          <w:lang w:val="en-US"/>
+        </w:rPr>
+      </w:pPr>
+      <w:r>
+        <w:rPr>
+          <w:rStyle w:val="Funotenzeichen"/>
+        </w:rPr>
+        <w:footnoteRef/>
+      </w:r>
+      <w:r>
+        <w:rPr>
+          <w:lang w:val="en-US"/>
+        </w:rPr>
+        <w:t xml:space="preserve"> Mitera [mi.tʁa]: Greek, </w:t>
+      </w:r>
+      <w:r>
+        <w:rPr>
+          <w:lang w:val="en-US"/>
+        </w:rPr>
+        <w:t>‚M</w:t>
+      </w:r>
+      <w:r>
+        <w:rPr>
+          <w:lang w:val="en-US"/>
+        </w:rPr>
+        <w:t>other</w:t>
+      </w:r>
+      <w:r>
+        <w:rPr>
+          <w:lang w:val="en-US"/>
+        </w:rPr>
+        <w:t>‘</w:t>
+      </w:r>
+    </w:p>
+  </w:footnote>
+</w:footnotes>
 </file>
 
 <file path=word/styles.xml><?xml version="1.0" encoding="utf-8"?>
@@ -1039,6 +1988,45 @@
       <w:spacing w:val="5"/>
     </w:rPr>
   </w:style>
+  <w:style w:type="paragraph" w:styleId="Funotentext">
+    <w:name w:val="footnote text"/>
+    <w:basedOn w:val="Standard"/>
+    <w:link w:val="FunotentextZchn"/>
+    <w:uiPriority w:val="99"/>
+    <w:semiHidden/>
+    <w:unhideWhenUsed/>
+    <w:rsid w:val="00EF0EBA"/>
+    <w:pPr>
+      <w:spacing w:after="0" w:line="240" w:lineRule="auto"/>
+    </w:pPr>
+    <w:rPr>
+      <w:sz w:val="20"/>
+      <w:szCs w:val="20"/>
+    </w:rPr>
+  </w:style>
+  <w:style w:type="character" w:customStyle="1" w:styleId="FunotentextZchn">
+    <w:name w:val="Fußnotentext Zchn"/>
+    <w:basedOn w:val="Absatz-Standardschriftart"/>
+    <w:link w:val="Funotentext"/>
+    <w:uiPriority w:val="99"/>
+    <w:semiHidden/>
+    <w:rsid w:val="00EF0EBA"/>
+    <w:rPr>
+      <w:sz w:val="20"/>
+      <w:szCs w:val="20"/>
+    </w:rPr>
+  </w:style>
+  <w:style w:type="character" w:styleId="Funotenzeichen">
+    <w:name w:val="footnote reference"/>
+    <w:basedOn w:val="Absatz-Standardschriftart"/>
+    <w:uiPriority w:val="99"/>
+    <w:semiHidden/>
+    <w:unhideWhenUsed/>
+    <w:rsid w:val="00EF0EBA"/>
+    <w:rPr>
+      <w:vertAlign w:val="superscript"/>
+    </w:rPr>
+  </w:style>
 </w:styles>
 </file>
 
@@ -1335,4 +2323,16 @@
     </a:ext>
   </a:extLst>
 </a:theme>
+</file>
+
+<file path=customXml/item1.xml><?xml version="1.0" encoding="utf-8"?>
+<b:Sources xmlns:b="http://schemas.openxmlformats.org/officeDocument/2006/bibliography" xmlns="http://schemas.openxmlformats.org/officeDocument/2006/bibliography" SelectedStyle="\APASixthEditionOfficeOnline.xsl" StyleName="APA" Version="6"/>
+</file>
+
+<file path=customXml/itemProps1.xml><?xml version="1.0" encoding="utf-8"?>
+<ds:datastoreItem xmlns:ds="http://schemas.openxmlformats.org/officeDocument/2006/customXml" ds:itemID="{F14B07AD-116B-4E02-9A47-C108605D32FB}">
+  <ds:schemaRefs>
+    <ds:schemaRef ds:uri="http://schemas.openxmlformats.org/officeDocument/2006/bibliography"/>
+  </ds:schemaRefs>
+</ds:datastoreItem>
 </file>
</xml_diff>